<commit_message>
update manual con lo de fer
</commit_message>
<xml_diff>
--- a/docs/ManualEjecucion.docx
+++ b/docs/ManualEjecucion.docx
@@ -605,7 +605,7 @@
         <w:pStyle w:val="Heading2"/>
       </w:pPr>
       <w:r>
-        <w:t xml:space="preserve">5. Materialización en PostgreSQL</w:t>
+        <w:t xml:space="preserve">5. Materialización en PostgreSQL y Elasticsearch</w:t>
       </w:r>
     </w:p>
     <w:p>
@@ -613,7 +613,7 @@
         <w:spacing w:after="120"/>
       </w:pPr>
       <w:r>
-        <w:t xml:space="preserve">El driver JDBC de Postgres ya viene en la imagen:</w:t>
+        <w:t xml:space="preserve">Programa principal que escribe en ambas bases de un solo comando (crea los índices de ES, indexa los documentos y escribe la tabla de Postgres). El driver JDBC de Postgres y el cliente de Elasticsearch ya vienen en la imagen:</w:t>
       </w:r>
     </w:p>
     <w:p>
@@ -627,7 +627,18 @@
           <w:sz w:val="19"/>
           <w:szCs w:val="19"/>
         </w:rPr>
-        <w:t xml:space="preserve">/opt/spark/bin/spark-submit src/db/postgres_writer.py</w:t>
+        <w:t xml:space="preserve">export PYTHONPATH=/opt/spark</w:t>
+      </w:r>
+      <w:r>
+        <w:br/>
+      </w:r>
+      <w:r>
+        <w:rPr>
+          <w:rFonts w:ascii="Courier New" w:cs="Courier New" w:eastAsia="Courier New" w:hAnsi="Courier New"/>
+          <w:sz w:val="19"/>
+          <w:szCs w:val="19"/>
+        </w:rPr>
+        <w:t xml:space="preserve">/opt/spark/bin/spark-submit src/db/main_materializacion.py</w:t>
       </w:r>
     </w:p>
     <w:p>
@@ -635,7 +646,7 @@
         <w:spacing w:after="120"/>
       </w:pPr>
       <w:r>
-        <w:t xml:space="preserve">Validación con SQL:</w:t>
+        <w:t xml:space="preserve">Alternativa por módulos sueltos:</w:t>
       </w:r>
     </w:p>
     <w:p>
@@ -649,26 +660,29 @@
           <w:sz w:val="19"/>
           <w:szCs w:val="19"/>
         </w:rPr>
-        <w:t xml:space="preserve">docker exec -it postgres psql -U bigdata -d hotel_reviews -c \</w:t>
-      </w:r>
-      <w:r>
-        <w:br/>
-      </w:r>
-      <w:r>
-        <w:rPr>
-          <w:rFonts w:ascii="Courier New" w:cs="Courier New" w:eastAsia="Courier New" w:hAnsi="Courier New"/>
-          <w:sz w:val="19"/>
-          <w:szCs w:val="19"/>
-        </w:rPr>
-        <w:t xml:space="preserve">  "SELECT region, COUNT(*), ROUND(AVG(rating),2) FROM hotel_reviews GROUP BY region;"</w:t>
-      </w:r>
-    </w:p>
-    <w:p>
-      <w:pPr>
-        <w:pStyle w:val="Heading2"/>
-      </w:pPr>
-      <w:r>
-        <w:t xml:space="preserve">6. Materialización en Elasticsearch</w:t>
+        <w:t xml:space="preserve">python3 src/db/es_setup.py                          # crea los 2 indices (BM25 + semantico)</w:t>
+      </w:r>
+      <w:r>
+        <w:br/>
+      </w:r>
+      <w:r>
+        <w:rPr>
+          <w:rFonts w:ascii="Courier New" w:cs="Courier New" w:eastAsia="Courier New" w:hAnsi="Courier New"/>
+          <w:sz w:val="19"/>
+          <w:szCs w:val="19"/>
+        </w:rPr>
+        <w:t xml:space="preserve">python3 src/db/es_indexer.py                        # indexa los 25.600 documentos</w:t>
+      </w:r>
+      <w:r>
+        <w:br/>
+      </w:r>
+      <w:r>
+        <w:rPr>
+          <w:rFonts w:ascii="Courier New" w:cs="Courier New" w:eastAsia="Courier New" w:hAnsi="Courier New"/>
+          <w:sz w:val="19"/>
+          <w:szCs w:val="19"/>
+        </w:rPr>
+        <w:t xml:space="preserve">/opt/spark/bin/spark-submit src/db/postgres_writer.py   # escribe en PostgreSQL</w:t>
       </w:r>
     </w:p>
     <w:p>
@@ -676,7 +690,7 @@
         <w:spacing w:after="120"/>
       </w:pPr>
       <w:r>
-        <w:t xml:space="preserve">Crea dos índices (BM25 sin vectores + semántico con vectores) y carga los documentos:</w:t>
+        <w:t xml:space="preserve">Validación con SQL:</w:t>
       </w:r>
     </w:p>
     <w:p>
@@ -690,18 +704,18 @@
           <w:sz w:val="19"/>
           <w:szCs w:val="19"/>
         </w:rPr>
-        <w:t xml:space="preserve">python3 src/db/es_setup.py     # crea los 2 índices con sus mappings</w:t>
-      </w:r>
-      <w:r>
-        <w:br/>
-      </w:r>
-      <w:r>
-        <w:rPr>
-          <w:rFonts w:ascii="Courier New" w:cs="Courier New" w:eastAsia="Courier New" w:hAnsi="Courier New"/>
-          <w:sz w:val="19"/>
-          <w:szCs w:val="19"/>
-        </w:rPr>
-        <w:t xml:space="preserve">python3 src/db/es_indexer.py   # carga los 25.600 documentos</w:t>
+        <w:t xml:space="preserve">docker exec -it postgres psql -U bigdata -d hotel_reviews -c \</w:t>
+      </w:r>
+      <w:r>
+        <w:br/>
+      </w:r>
+      <w:r>
+        <w:rPr>
+          <w:rFonts w:ascii="Courier New" w:cs="Courier New" w:eastAsia="Courier New" w:hAnsi="Courier New"/>
+          <w:sz w:val="19"/>
+          <w:szCs w:val="19"/>
+        </w:rPr>
+        <w:t xml:space="preserve">  "SELECT region, COUNT(*), ROUND(AVG(rating),2) FROM hotel_reviews GROUP BY region;"</w:t>
       </w:r>
     </w:p>
     <w:p>
@@ -709,7 +723,7 @@
         <w:pStyle w:val="Heading2"/>
       </w:pPr>
       <w:r>
-        <w:t xml:space="preserve">7. Búsqueda semántica</w:t>
+        <w:t xml:space="preserve">6. Búsqueda semántica</w:t>
       </w:r>
     </w:p>
     <w:p>
@@ -739,7 +753,7 @@
         <w:pStyle w:val="Heading2"/>
       </w:pPr>
       <w:r>
-        <w:t xml:space="preserve">8. Modelos de predicción</w:t>
+        <w:t xml:space="preserve">7. Modelos de predicción</w:t>
       </w:r>
     </w:p>
     <w:p>
@@ -780,7 +794,7 @@
         <w:pStyle w:val="Heading2"/>
       </w:pPr>
       <w:r>
-        <w:t xml:space="preserve">9. Dashboards de Kibana</w:t>
+        <w:t xml:space="preserve">8. Dashboards de Kibana</w:t>
       </w:r>
     </w:p>
     <w:p>
@@ -809,7 +823,7 @@
         <w:pStyle w:val="Heading2"/>
       </w:pPr>
       <w:r>
-        <w:t xml:space="preserve">10. Detener el entorno</w:t>
+        <w:t xml:space="preserve">9. Detener el entorno</w:t>
       </w:r>
     </w:p>
     <w:p>

</xml_diff>